<commit_message>
Fix syntax error from the previous commit
The previous commit closed the Fundamentals section before the new question
rather than after it, leaving an orphaned tuple and an unmatched bracket --
the generator would not import at all. The question now sits inside that
section, which is where it belongs anyway.
</commit_message>
<xml_diff>
--- a/docs/interview/Interview-Prep-Stage-0-1.docx
+++ b/docs/interview/Interview-Prep-Stage-0-1.docx
@@ -1374,6 +1374,75 @@
       </w:r>
     </w:p>
     <w:p>
+      <w:r>
+        <w:rPr>
+          <w:b/>
+          <w:color w:val="16182A"/>
+          <w:sz w:val="22"/>
+        </w:rPr>
+        <w:t>You do your DSA in Java but this project is Python. Why?</w:t>
+      </w:r>
+    </w:p>
+    <w:p>
+      <w:r>
+        <w:rPr>
+          <w:b/>
+          <w:color w:val="34418C"/>
+          <w:sz w:val="18"/>
+        </w:rPr>
+        <w:t xml:space="preserve">Why they ask:  </w:t>
+      </w:r>
+      <w:r>
+        <w:rPr>
+          <w:i w:val="0"/>
+          <w:color w:val="464A63"/>
+          <w:sz w:val="18"/>
+        </w:rPr>
+        <w:t>Common when your resume shows both. They are checking whether it was a deliberate choice or an accident, and whether you can justify a tool decision.</w:t>
+      </w:r>
+    </w:p>
+    <w:p>
+      <w:pPr>
+        <w:ind w:left="360"/>
+      </w:pPr>
+      <w:r>
+        <w:rPr>
+          <w:b/>
+          <w:color w:val="34418C"/>
+          <w:sz w:val="19"/>
+        </w:rPr>
+        <w:t xml:space="preserve">Model answer:  </w:t>
+      </w:r>
+      <w:r>
+        <w:rPr>
+          <w:i/>
+          <w:sz w:val="20"/>
+        </w:rPr>
+        <w:t>Java for DSA because that is what I am fastest and most accurate in under time pressure, and it is accepted everywhere. Python for this project because the ecosystem is where the work is: pandas for the data pipeline, spaCy for text processing. Writing an NLP pipeline in Java would have meant fighting the tooling for no benefit. I pick the language that fits the problem rather than defending one.</w:t>
+      </w:r>
+    </w:p>
+    <w:p>
+      <w:pPr>
+        <w:ind w:left="360"/>
+      </w:pPr>
+      <w:r>
+        <w:rPr>
+          <w:b/>
+          <w:color w:val="9B3355"/>
+          <w:sz w:val="18"/>
+        </w:rPr>
+        <w:t xml:space="preserve">Weak answer:  </w:t>
+      </w:r>
+      <w:r>
+        <w:rPr>
+          <w:i w:val="0"/>
+          <w:color w:val="464A63"/>
+          <w:sz w:val="18"/>
+        </w:rPr>
+        <w:t>Apologising for it, or calling yourself 'a Java developer' -- which invites the question of why your only project is in something else.</w:t>
+      </w:r>
+    </w:p>
+    <w:p>
       <w:pPr>
         <w:pStyle w:val="Heading1"/>
       </w:pPr>

</xml_diff>